<commit_message>
Updating the documentation of the application
</commit_message>
<xml_diff>
--- a/Docs/AIChatAssist_ProjectDocumentation.docx
+++ b/Docs/AIChatAssist_ProjectDocumentation.docx
@@ -42,7 +42,61 @@
         <w:pStyle w:val="Heading2"/>
       </w:pPr>
       <w:r>
-        <w:t>2. Key Features</w:t>
+        <w:t>2. Architecture Diagram</w:t>
+      </w:r>
+    </w:p>
+    <w:p>
+      <w:r>
+        <w:t>The architecture diagram below illustrates the end-to-end application flow, including frontend rendering, state management, secure API communication, AI provider integration, fallback handling, and streaming response processing.</w:t>
+      </w:r>
+    </w:p>
+    <w:p>
+      <w:r>
+        <w:drawing>
+          <wp:inline xmlns:a="http://schemas.openxmlformats.org/drawingml/2006/main" xmlns:pic="http://schemas.openxmlformats.org/drawingml/2006/picture">
+            <wp:extent cx="6217920" cy="3997234"/>
+            <wp:docPr id="1" name="Picture 1"/>
+            <wp:cNvGraphicFramePr>
+              <a:graphicFrameLocks noChangeAspect="1"/>
+            </wp:cNvGraphicFramePr>
+            <a:graphic>
+              <a:graphicData uri="http://schemas.openxmlformats.org/drawingml/2006/picture">
+                <pic:pic>
+                  <pic:nvPicPr>
+                    <pic:cNvPr id="0" name="architecture_diagram.png"/>
+                    <pic:cNvPicPr/>
+                  </pic:nvPicPr>
+                  <pic:blipFill>
+                    <a:blip r:embed="rId9"/>
+                    <a:stretch>
+                      <a:fillRect/>
+                    </a:stretch>
+                  </pic:blipFill>
+                  <pic:spPr>
+                    <a:xfrm>
+                      <a:off x="0" y="0"/>
+                      <a:ext cx="6217920" cy="3997234"/>
+                    </a:xfrm>
+                    <a:prstGeom prst="rect"/>
+                  </pic:spPr>
+                </pic:pic>
+              </a:graphicData>
+            </a:graphic>
+          </wp:inline>
+        </w:drawing>
+      </w:r>
+    </w:p>
+    <w:p>
+      <w:r>
+        <w:t>The application uses a secure server-side architecture where all AI provider communication is handled through Next.js API routes. Gemini acts as the primary AI provider, while Groq serves as a fallback provider during quota or rate-limit failures. Streaming responses are processed using Server-Sent Events (SSE) and dynamically rendered in the frontend.</w:t>
+      </w:r>
+    </w:p>
+    <w:p>
+      <w:pPr>
+        <w:pStyle w:val="Heading2"/>
+      </w:pPr>
+      <w:r>
+        <w:t>3. Key Features</w:t>
       </w:r>
     </w:p>
     <w:p>
@@ -138,7 +192,7 @@
         <w:pStyle w:val="ListBullet"/>
       </w:pPr>
       <w:r>
-        <w:t>Delete and clear conversation actions (sidebar delete and header clear chat)</w:t>
+        <w:t>Delete and clear conversation actions</w:t>
       </w:r>
     </w:p>
     <w:p>
@@ -170,7 +224,7 @@
         <w:pStyle w:val="Heading2"/>
       </w:pPr>
       <w:r>
-        <w:t>3. Technology Stack</w:t>
+        <w:t>4. Technology Stack</w:t>
       </w:r>
     </w:p>
     <w:tbl>
@@ -431,12 +485,113 @@
         <w:pStyle w:val="Heading2"/>
       </w:pPr>
       <w:r>
-        <w:t>4. Application Architecture</w:t>
+        <w:t>5. Design Decisions</w:t>
       </w:r>
     </w:p>
     <w:p>
+      <w:pPr>
+        <w:pStyle w:val="ListBullet"/>
+      </w:pPr>
       <w:r>
-        <w:t>The application follows a modular component-based architecture using the Next.js App Router. Frontend functionality is separated into reusable components, custom hooks, utility modules, and secure server-side API routes.</w:t>
+        <w:rPr>
+          <w:b/>
+        </w:rPr>
+        <w:t xml:space="preserve">Server-side API Integration: </w:t>
+      </w:r>
+      <w:r>
+        <w:t>AI provider communication is handled through server-side API routes to ensure API keys are never exposed to the browser.</w:t>
+      </w:r>
+    </w:p>
+    <w:p>
+      <w:pPr>
+        <w:pStyle w:val="ListBullet"/>
+      </w:pPr>
+      <w:r>
+        <w:rPr>
+          <w:b/>
+        </w:rPr>
+        <w:t xml:space="preserve">Streaming Response Implementation: </w:t>
+      </w:r>
+      <w:r>
+        <w:t>Streaming responses were implemented using SSE to provide a real-time conversational experience similar to modern Generative AI products.</w:t>
+      </w:r>
+    </w:p>
+    <w:p>
+      <w:pPr>
+        <w:pStyle w:val="ListBullet"/>
+      </w:pPr>
+      <w:r>
+        <w:rPr>
+          <w:b/>
+        </w:rPr>
+        <w:t xml:space="preserve">Groq Fallback Mechanism: </w:t>
+      </w:r>
+      <w:r>
+        <w:t>Automatic fallback handling was implemented so the application can continue responding even when Gemini quota or rate limits are reached.</w:t>
+      </w:r>
+    </w:p>
+    <w:p>
+      <w:pPr>
+        <w:pStyle w:val="ListBullet"/>
+      </w:pPr>
+      <w:r>
+        <w:rPr>
+          <w:b/>
+        </w:rPr>
+        <w:t xml:space="preserve">Component-Based Architecture: </w:t>
+      </w:r>
+      <w:r>
+        <w:t>Reusable React components and custom hooks were used to improve maintainability, scalability, and code organization.</w:t>
+      </w:r>
+    </w:p>
+    <w:p>
+      <w:pPr>
+        <w:pStyle w:val="ListBullet"/>
+      </w:pPr>
+      <w:r>
+        <w:rPr>
+          <w:b/>
+        </w:rPr>
+        <w:t xml:space="preserve">Local Storage Persistence: </w:t>
+      </w:r>
+      <w:r>
+        <w:t>localStorage was selected for lightweight client-side conversation persistence without introducing additional database complexity.</w:t>
+      </w:r>
+    </w:p>
+    <w:p>
+      <w:pPr>
+        <w:pStyle w:val="ListBullet"/>
+      </w:pPr>
+      <w:r>
+        <w:rPr>
+          <w:b/>
+        </w:rPr>
+        <w:t xml:space="preserve">Markdown Sanitization: </w:t>
+      </w:r>
+      <w:r>
+        <w:t>Markdown responses are sanitized before rendering to reduce security risks and improve content safety.</w:t>
+      </w:r>
+    </w:p>
+    <w:p>
+      <w:pPr>
+        <w:pStyle w:val="ListBullet"/>
+      </w:pPr>
+      <w:r>
+        <w:rPr>
+          <w:b/>
+        </w:rPr>
+        <w:t xml:space="preserve">Tailwind CSS: </w:t>
+      </w:r>
+      <w:r>
+        <w:t>Tailwind CSS was used to build a responsive UI quickly while maintaining consistent styling across the application.</w:t>
+      </w:r>
+    </w:p>
+    <w:p>
+      <w:pPr>
+        <w:pStyle w:val="Heading2"/>
+      </w:pPr>
+      <w:r>
+        <w:t>6. Application Architecture</w:t>
       </w:r>
     </w:p>
     <w:p>
@@ -508,7 +663,7 @@
         <w:pStyle w:val="Heading2"/>
       </w:pPr>
       <w:r>
-        <w:t>5. Project Structure</w:t>
+        <w:t>7. Project Structure</w:t>
       </w:r>
     </w:p>
     <w:p>
@@ -571,16 +726,11 @@
       </w:r>
     </w:p>
     <w:p>
-      <w:r>
-        <w:t>The project structure is organized to separate frontend UI logic, AI provider integrations, stream handling, reusable utilities, and testing configuration for better scalability and maintainability.</w:t>
-      </w:r>
-    </w:p>
-    <w:p>
       <w:pPr>
         <w:pStyle w:val="Heading2"/>
       </w:pPr>
       <w:r>
-        <w:t>6. Environment Configuration</w:t>
+        <w:t>8. Environment Configuration</w:t>
       </w:r>
     </w:p>
     <w:p>
@@ -605,143 +755,12 @@
         <w:t>The application supports both Groq and Google Gemini AI providers. The active provider is controlled using the AI_PROVIDER environment variable.</w:t>
       </w:r>
     </w:p>
-    <w:tbl>
-      <w:tblPr>
-        <w:tblStyle w:val="TableGrid"/>
-        <w:tblW w:type="auto" w:w="0"/>
-        <w:tblLook w:firstColumn="1" w:firstRow="1" w:lastColumn="0" w:lastRow="0" w:noHBand="0" w:noVBand="1" w:val="04A0"/>
-      </w:tblPr>
-      <w:tblGrid>
-        <w:gridCol w:w="4320"/>
-        <w:gridCol w:w="4320"/>
-      </w:tblGrid>
-      <w:tr>
-        <w:tc>
-          <w:tcPr>
-            <w:tcW w:type="dxa" w:w="4320"/>
-          </w:tcPr>
-          <w:p>
-            <w:r>
-              <w:t>Configuration</w:t>
-            </w:r>
-          </w:p>
-        </w:tc>
-        <w:tc>
-          <w:tcPr>
-            <w:tcW w:type="dxa" w:w="4320"/>
-          </w:tcPr>
-          <w:p>
-            <w:r>
-              <w:t>Primary Provider</w:t>
-            </w:r>
-          </w:p>
-        </w:tc>
-      </w:tr>
-      <w:tr>
-        <w:tc>
-          <w:tcPr>
-            <w:tcW w:type="dxa" w:w="4320"/>
-          </w:tcPr>
-          <w:p>
-            <w:r>
-              <w:t>AI_PROVIDER=groq</w:t>
-            </w:r>
-          </w:p>
-        </w:tc>
-        <w:tc>
-          <w:tcPr>
-            <w:tcW w:type="dxa" w:w="4320"/>
-          </w:tcPr>
-          <w:p>
-            <w:r>
-              <w:t>Groq</w:t>
-            </w:r>
-          </w:p>
-        </w:tc>
-      </w:tr>
-      <w:tr>
-        <w:tc>
-          <w:tcPr>
-            <w:tcW w:type="dxa" w:w="4320"/>
-          </w:tcPr>
-          <w:p>
-            <w:r>
-              <w:t>AI_PROVIDER=gemini</w:t>
-            </w:r>
-          </w:p>
-        </w:tc>
-        <w:tc>
-          <w:tcPr>
-            <w:tcW w:type="dxa" w:w="4320"/>
-          </w:tcPr>
-          <w:p>
-            <w:r>
-              <w:t>Gemini</w:t>
-            </w:r>
-          </w:p>
-        </w:tc>
-      </w:tr>
-      <w:tr>
-        <w:tc>
-          <w:tcPr>
-            <w:tcW w:type="dxa" w:w="4320"/>
-          </w:tcPr>
-          <w:p>
-            <w:r>
-              <w:t>Both API keys configured without AI_PROVIDER</w:t>
-            </w:r>
-          </w:p>
-        </w:tc>
-        <w:tc>
-          <w:tcPr>
-            <w:tcW w:type="dxa" w:w="4320"/>
-          </w:tcPr>
-          <w:p>
-            <w:r>
-              <w:t>Gemini</w:t>
-            </w:r>
-          </w:p>
-        </w:tc>
-      </w:tr>
-      <w:tr>
-        <w:tc>
-          <w:tcPr>
-            <w:tcW w:type="dxa" w:w="4320"/>
-          </w:tcPr>
-          <w:p>
-            <w:r>
-              <w:t>Only GROQ_API_KEY configured</w:t>
-            </w:r>
-          </w:p>
-        </w:tc>
-        <w:tc>
-          <w:tcPr>
-            <w:tcW w:type="dxa" w:w="4320"/>
-          </w:tcPr>
-          <w:p>
-            <w:r>
-              <w:t>Groq</w:t>
-            </w:r>
-          </w:p>
-        </w:tc>
-      </w:tr>
-    </w:tbl>
-    <w:p>
-      <w:r>
-        <w:t>When Gemini is configured as the primary provider and rate-limit or quota-limit errors occur, the application automatically retries requests using Groq if a Groq API key is available.</w:t>
-      </w:r>
-    </w:p>
-    <w:p>
-      <w:r>
-        <w:t>All API credentials are securely managed using server-side environment variables and are never exposed in browser-side code.</w:t>
-      </w:r>
-    </w:p>
     <w:p>
       <w:pPr>
         <w:pStyle w:val="Heading2"/>
       </w:pPr>
       <w:r>
-        <w:t>7. Installation and Running the Application</w:t>
+        <w:t>9. Installation and Running the Application</w:t>
       </w:r>
     </w:p>
     <w:p>
@@ -988,7 +1007,7 @@
         <w:pStyle w:val="Heading2"/>
       </w:pPr>
       <w:r>
-        <w:t>8. Deployment</w:t>
+        <w:t>10. Deployment</w:t>
       </w:r>
     </w:p>
     <w:p>
@@ -1006,7 +1025,7 @@
         <w:pStyle w:val="Heading2"/>
       </w:pPr>
       <w:r>
-        <w:t>9. Coding Standards and Best Practices</w:t>
+        <w:t>11. Coding Standards and Best Practices</w:t>
       </w:r>
     </w:p>
     <w:p>
@@ -1102,7 +1121,7 @@
         <w:pStyle w:val="Heading2"/>
       </w:pPr>
       <w:r>
-        <w:t>10. Future Enhancements</w:t>
+        <w:t>12. Future Enhancements</w:t>
       </w:r>
     </w:p>
     <w:p>
@@ -1158,7 +1177,7 @@
         <w:pStyle w:val="Heading2"/>
       </w:pPr>
       <w:r>
-        <w:t>11. Conclusion</w:t>
+        <w:t>13. Conclusion</w:t>
       </w:r>
     </w:p>
     <w:p>

</xml_diff>

<commit_message>
Updating the documentation of application
</commit_message>
<xml_diff>
--- a/Docs/AIChatAssist_ProjectDocumentation.docx
+++ b/Docs/AIChatAssist_ProjectDocumentation.docx
@@ -8,7 +8,7 @@
         <w:jc w:val="center"/>
       </w:pPr>
       <w:r>
-        <w:t>AI Chat Assist - Technical Documentation</w:t>
+        <w:t>AI Chat Assist - Complete Technical Documentation</w:t>
       </w:r>
     </w:p>
     <w:p>
@@ -16,7 +16,7 @@
         <w:rPr>
           <w:b/>
         </w:rPr>
-        <w:t>This document provides a technical overview of the AI Chat Assist application developed using Next.js, React, TypeScript, and AI integrations with Groq and Google Gemini.</w:t>
+        <w:t>This document provides a complete technical overview of the AI Chat Assist application developed using Next.js, React, TypeScript, and AI integrations with Groq and Google Gemini.</w:t>
       </w:r>
     </w:p>
     <w:p>
@@ -29,12 +29,12 @@
     </w:p>
     <w:p>
       <w:r>
-        <w:t>AI Chat Assist is a modern AI-powered chat application designed to provide users with real-time conversational AI interactions using streaming responses similar to mainstream Generative AI products.</w:t>
+        <w:t>AI Chat Assist is a modern AI-powered conversational web application that enables users to interact with AI models using streaming responses similar to mainstream Generative AI platforms.</w:t>
       </w:r>
     </w:p>
     <w:p>
       <w:r>
-        <w:t>The application was designed with a focus on scalable architecture, reusable components, secure API communication, responsive design, and production-style frontend engineering practices.</w:t>
+        <w:t>The application was designed with a focus on scalable architecture, reusable components, secure API communication, responsive UI design, maintainability, and production-style frontend engineering practices.</w:t>
       </w:r>
     </w:p>
     <w:p>
@@ -47,14 +47,14 @@
     </w:p>
     <w:p>
       <w:r>
-        <w:t>The architecture diagram below illustrates the end-to-end application flow, including frontend rendering, state management, secure API communication, AI provider integration, fallback handling, and streaming response processing.</w:t>
+        <w:t>The architecture diagram below illustrates the end-to-end application flow including frontend rendering, state management, secure API communication, AI provider selection, SSE streaming, JSON fallback handling, and response rendering.</w:t>
       </w:r>
     </w:p>
     <w:p>
       <w:r>
         <w:drawing>
           <wp:inline xmlns:a="http://schemas.openxmlformats.org/drawingml/2006/main" xmlns:pic="http://schemas.openxmlformats.org/drawingml/2006/picture">
-            <wp:extent cx="6217920" cy="3997234"/>
+            <wp:extent cx="6400800" cy="4000500"/>
             <wp:docPr id="1" name="Picture 1"/>
             <wp:cNvGraphicFramePr>
               <a:graphicFrameLocks noChangeAspect="1"/>
@@ -63,7 +63,7 @@
               <a:graphicData uri="http://schemas.openxmlformats.org/drawingml/2006/picture">
                 <pic:pic>
                   <pic:nvPicPr>
-                    <pic:cNvPr id="0" name="architecture_diagram.png"/>
+                    <pic:cNvPr id="0" name="final_corrected_architecture.png"/>
                     <pic:cNvPicPr/>
                   </pic:nvPicPr>
                   <pic:blipFill>
@@ -75,7 +75,7 @@
                   <pic:spPr>
                     <a:xfrm>
                       <a:off x="0" y="0"/>
-                      <a:ext cx="6217920" cy="3997234"/>
+                      <a:ext cx="6400800" cy="4000500"/>
                     </a:xfrm>
                     <a:prstGeom prst="rect"/>
                   </pic:spPr>
@@ -88,7 +88,7 @@
     </w:p>
     <w:p>
       <w:r>
-        <w:t>The application uses a secure server-side architecture where all AI provider communication is handled through Next.js API routes. Gemini acts as the primary AI provider, while Groq serves as a fallback provider during quota or rate-limit failures. Streaming responses are processed using Server-Sent Events (SSE) and dynamically rendered in the frontend.</w:t>
+        <w:t>All AI calls go through Next.js API routes so API keys remain secure on the server. The active provider is determined using AI_PROVIDER and the configured environment variables. When Gemini is configured as the primary provider and quota or rate-limit errors occur, the application retries requests using Groq if a Groq API key is available. Responses stream over SSE and are rendered in the frontend using sanitized Markdown rendering.</w:t>
       </w:r>
     </w:p>
     <w:p>
@@ -527,7 +527,7 @@
         <w:t xml:space="preserve">Groq Fallback Mechanism: </w:t>
       </w:r>
       <w:r>
-        <w:t>Automatic fallback handling was implemented so the application can continue responding even when Gemini quota or rate limits are reached.</w:t>
+        <w:t>Fallback handling was implemented so the application can continue responding when Gemini quota or rate limits are reached.</w:t>
       </w:r>
     </w:p>
     <w:p>
@@ -569,7 +569,7 @@
         <w:t xml:space="preserve">Markdown Sanitization: </w:t>
       </w:r>
       <w:r>
-        <w:t>Markdown responses are sanitized before rendering to reduce security risks and improve content safety.</w:t>
+        <w:t>Markdown responses are sanitized before rendering to improve content safety and reduce security risks.</w:t>
       </w:r>
     </w:p>
     <w:p>
@@ -583,7 +583,7 @@
         <w:t xml:space="preserve">Tailwind CSS: </w:t>
       </w:r>
       <w:r>
-        <w:t>Tailwind CSS was used to build a responsive UI quickly while maintaining consistent styling across the application.</w:t>
+        <w:t>Tailwind CSS was used to rapidly build a responsive and consistent user interface.</w:t>
       </w:r>
     </w:p>
     <w:p>
@@ -726,6 +726,11 @@
       </w:r>
     </w:p>
     <w:p>
+      <w:r>
+        <w:t>The project structure separates frontend UI logic, AI provider integrations, stream handling, utility functions, and testing configuration to improve maintainability and scalability.</w:t>
+      </w:r>
+    </w:p>
+    <w:p>
       <w:pPr>
         <w:pStyle w:val="Heading2"/>
       </w:pPr>
@@ -753,6 +758,132 @@
     <w:p>
       <w:r>
         <w:t>The application supports both Groq and Google Gemini AI providers. The active provider is controlled using the AI_PROVIDER environment variable.</w:t>
+      </w:r>
+    </w:p>
+    <w:tbl>
+      <w:tblPr>
+        <w:tblStyle w:val="TableGrid"/>
+        <w:tblW w:type="auto" w:w="0"/>
+        <w:tblLook w:firstColumn="1" w:firstRow="1" w:lastColumn="0" w:lastRow="0" w:noHBand="0" w:noVBand="1" w:val="04A0"/>
+      </w:tblPr>
+      <w:tblGrid>
+        <w:gridCol w:w="4320"/>
+        <w:gridCol w:w="4320"/>
+      </w:tblGrid>
+      <w:tr>
+        <w:tc>
+          <w:tcPr>
+            <w:tcW w:type="dxa" w:w="4320"/>
+          </w:tcPr>
+          <w:p>
+            <w:r>
+              <w:t>Configuration</w:t>
+            </w:r>
+          </w:p>
+        </w:tc>
+        <w:tc>
+          <w:tcPr>
+            <w:tcW w:type="dxa" w:w="4320"/>
+          </w:tcPr>
+          <w:p>
+            <w:r>
+              <w:t>Primary Provider</w:t>
+            </w:r>
+          </w:p>
+        </w:tc>
+      </w:tr>
+      <w:tr>
+        <w:tc>
+          <w:tcPr>
+            <w:tcW w:type="dxa" w:w="4320"/>
+          </w:tcPr>
+          <w:p>
+            <w:r>
+              <w:t>AI_PROVIDER=groq</w:t>
+            </w:r>
+          </w:p>
+        </w:tc>
+        <w:tc>
+          <w:tcPr>
+            <w:tcW w:type="dxa" w:w="4320"/>
+          </w:tcPr>
+          <w:p>
+            <w:r>
+              <w:t>Groq</w:t>
+            </w:r>
+          </w:p>
+        </w:tc>
+      </w:tr>
+      <w:tr>
+        <w:tc>
+          <w:tcPr>
+            <w:tcW w:type="dxa" w:w="4320"/>
+          </w:tcPr>
+          <w:p>
+            <w:r>
+              <w:t>AI_PROVIDER=gemini</w:t>
+            </w:r>
+          </w:p>
+        </w:tc>
+        <w:tc>
+          <w:tcPr>
+            <w:tcW w:type="dxa" w:w="4320"/>
+          </w:tcPr>
+          <w:p>
+            <w:r>
+              <w:t>Gemini</w:t>
+            </w:r>
+          </w:p>
+        </w:tc>
+      </w:tr>
+      <w:tr>
+        <w:tc>
+          <w:tcPr>
+            <w:tcW w:type="dxa" w:w="4320"/>
+          </w:tcPr>
+          <w:p>
+            <w:r>
+              <w:t>Both API keys configured without AI_PROVIDER</w:t>
+            </w:r>
+          </w:p>
+        </w:tc>
+        <w:tc>
+          <w:tcPr>
+            <w:tcW w:type="dxa" w:w="4320"/>
+          </w:tcPr>
+          <w:p>
+            <w:r>
+              <w:t>Gemini (default)</w:t>
+            </w:r>
+          </w:p>
+        </w:tc>
+      </w:tr>
+      <w:tr>
+        <w:tc>
+          <w:tcPr>
+            <w:tcW w:type="dxa" w:w="4320"/>
+          </w:tcPr>
+          <w:p>
+            <w:r>
+              <w:t>Only GROQ_API_KEY configured</w:t>
+            </w:r>
+          </w:p>
+        </w:tc>
+        <w:tc>
+          <w:tcPr>
+            <w:tcW w:type="dxa" w:w="4320"/>
+          </w:tcPr>
+          <w:p>
+            <w:r>
+              <w:t>Groq</w:t>
+            </w:r>
+          </w:p>
+        </w:tc>
+      </w:tr>
+    </w:tbl>
+    <w:p>
+      <w:r>
+        <w:t>All API credentials are securely managed through server-side environment variables and are never exposed in browser-side code.</w:t>
       </w:r>
     </w:p>
     <w:p>

</xml_diff>